<commit_message>
Add phase one to roadmap
</commit_message>
<xml_diff>
--- a/Ditto_Roadmap.docx
+++ b/Ditto_Roadmap.docx
@@ -4,10 +4,15 @@
   <w:body>
     <w:p>
       <w:pPr>
-        <w:pStyle w:val="Title"/>
         <w:jc w:val="center"/>
       </w:pPr>
       <w:r>
+        <w:rPr>
+          <w:rFonts w:ascii="Aptos Display" w:hAnsi="Aptos Display"/>
+          <w:b/>
+          <w:color w:val="1F4E79"/>
+          <w:sz w:val="52"/>
+        </w:rPr>
         <w:t>Ditto App Roadmap</w:t>
       </w:r>
     </w:p>
@@ -18,6 +23,7 @@
       <w:r>
         <w:rPr>
           <w:i/>
+          <w:sz w:val="24"/>
         </w:rPr>
         <w:t>A student-first task scheduler for the Congressional App Challenge</w:t>
       </w:r>
@@ -42,7 +48,7 @@
         <w:t xml:space="preserve">Plan focus: </w:t>
       </w:r>
       <w:r>
-        <w:t xml:space="preserve">Phases 2-5 | </w:t>
+        <w:t xml:space="preserve">Phases 1-5 | </w:t>
       </w:r>
       <w:r>
         <w:rPr>
@@ -64,6 +70,230 @@
         <w:pStyle w:val="Heading1"/>
       </w:pPr>
       <w:r>
+        <w:t>Phase 1: Decide The MVP</w:t>
+      </w:r>
+    </w:p>
+    <w:p>
+      <w:r>
+        <w:rPr>
+          <w:b/>
+        </w:rPr>
+        <w:t>Goal: Make the idea clear enough to build.</w:t>
+      </w:r>
+    </w:p>
+    <w:p>
+      <w:pPr>
+        <w:pStyle w:val="Heading2"/>
+      </w:pPr>
+      <w:r>
+        <w:t>1.1 Confirm The Core Idea</w:t>
+      </w:r>
+    </w:p>
+    <w:p>
+      <w:pPr>
+        <w:pStyle w:val="ListBullet"/>
+      </w:pPr>
+      <w:r>
+        <w:t>Confirm Ditto as a daily student planner.</w:t>
+      </w:r>
+    </w:p>
+    <w:p>
+      <w:pPr>
+        <w:pStyle w:val="ListBullet"/>
+      </w:pPr>
+      <w:r>
+        <w:t>Define the main problem: students need help turning tasks into a realistic plan.</w:t>
+      </w:r>
+    </w:p>
+    <w:p>
+      <w:pPr>
+        <w:pStyle w:val="ListBullet"/>
+      </w:pPr>
+      <w:r>
+        <w:t>Keep the first version focused on one-day planning instead of weekly or long-term planning.</w:t>
+      </w:r>
+    </w:p>
+    <w:p>
+      <w:pPr>
+        <w:pStyle w:val="Heading2"/>
+      </w:pPr>
+      <w:r>
+        <w:t>1.2 Define The Target User</w:t>
+      </w:r>
+    </w:p>
+    <w:p>
+      <w:pPr>
+        <w:pStyle w:val="ListBullet"/>
+      </w:pPr>
+      <w:r>
+        <w:t>Focus first on busy high school students.</w:t>
+      </w:r>
+    </w:p>
+    <w:p>
+      <w:pPr>
+        <w:pStyle w:val="ListBullet"/>
+      </w:pPr>
+      <w:r>
+        <w:t>Design for students managing homework, activities, chores, goals, and deadlines.</w:t>
+      </w:r>
+    </w:p>
+    <w:p>
+      <w:pPr>
+        <w:pStyle w:val="ListBullet"/>
+      </w:pPr>
+      <w:r>
+        <w:t>Keep the app simple enough to use in a few minutes each morning.</w:t>
+      </w:r>
+    </w:p>
+    <w:p>
+      <w:pPr>
+        <w:pStyle w:val="Heading2"/>
+      </w:pPr>
+      <w:r>
+        <w:t>1.3 Choose The MVP Promise</w:t>
+      </w:r>
+    </w:p>
+    <w:p>
+      <w:pPr>
+        <w:pStyle w:val="ListBullet"/>
+      </w:pPr>
+      <w:r>
+        <w:t>Use this promise for the first build: enter tasks and free time, then get a realistic plan for today.</w:t>
+      </w:r>
+    </w:p>
+    <w:p>
+      <w:pPr>
+        <w:pStyle w:val="ListBullet"/>
+      </w:pPr>
+      <w:r>
+        <w:t>Avoid features that distract from the main scheduling flow.</w:t>
+      </w:r>
+    </w:p>
+    <w:p>
+      <w:pPr>
+        <w:pStyle w:val="ListBullet"/>
+      </w:pPr>
+      <w:r>
+        <w:t>Make sure the MVP can be explained clearly in the Congressional App Challenge demo.</w:t>
+      </w:r>
+    </w:p>
+    <w:p>
+      <w:pPr>
+        <w:pStyle w:val="Heading2"/>
+      </w:pPr>
+      <w:r>
+        <w:t>1.4 Confirm The First Screens</w:t>
+      </w:r>
+    </w:p>
+    <w:p>
+      <w:pPr>
+        <w:pStyle w:val="ListBullet"/>
+      </w:pPr>
+      <w:r>
+        <w:t>Today screen for the generated schedule.</w:t>
+      </w:r>
+    </w:p>
+    <w:p>
+      <w:pPr>
+        <w:pStyle w:val="ListBullet"/>
+      </w:pPr>
+      <w:r>
+        <w:t>Tasks screen for saved tasks.</w:t>
+      </w:r>
+    </w:p>
+    <w:p>
+      <w:pPr>
+        <w:pStyle w:val="ListBullet"/>
+      </w:pPr>
+      <w:r>
+        <w:t>Add Task screen for creating new tasks.</w:t>
+      </w:r>
+    </w:p>
+    <w:p>
+      <w:pPr>
+        <w:pStyle w:val="ListBullet"/>
+      </w:pPr>
+      <w:r>
+        <w:t>Available Time screen for adding free work windows.</w:t>
+      </w:r>
+    </w:p>
+    <w:p>
+      <w:pPr>
+        <w:pStyle w:val="ListBullet"/>
+      </w:pPr>
+      <w:r>
+        <w:t>Generate Plan flow for building the daily schedule.</w:t>
+      </w:r>
+    </w:p>
+    <w:p>
+      <w:pPr>
+        <w:pStyle w:val="Heading2"/>
+      </w:pPr>
+      <w:r>
+        <w:t>1.5 Decide Technical Scope</w:t>
+      </w:r>
+    </w:p>
+    <w:p>
+      <w:pPr>
+        <w:pStyle w:val="ListBullet"/>
+      </w:pPr>
+      <w:r>
+        <w:t>Use Flutter and Dart as the main app stack.</w:t>
+      </w:r>
+    </w:p>
+    <w:p>
+      <w:pPr>
+        <w:pStyle w:val="ListBullet"/>
+      </w:pPr>
+      <w:r>
+        <w:t>Start local-first so the demo does not depend on accounts, cloud sync, or internet access.</w:t>
+      </w:r>
+    </w:p>
+    <w:p>
+      <w:pPr>
+        <w:pStyle w:val="ListBullet"/>
+      </w:pPr>
+      <w:r>
+        <w:t>Target web and Android-ready development first unless the team chooses another priority.</w:t>
+      </w:r>
+    </w:p>
+    <w:p>
+      <w:pPr>
+        <w:pStyle w:val="Heading2"/>
+      </w:pPr>
+      <w:r>
+        <w:t>1.6 Define Success For The First Review</w:t>
+      </w:r>
+    </w:p>
+    <w:p>
+      <w:pPr>
+        <w:pStyle w:val="ListBullet"/>
+      </w:pPr>
+      <w:r>
+        <w:t>The user can understand the app purpose from the first screen.</w:t>
+      </w:r>
+    </w:p>
+    <w:p>
+      <w:pPr>
+        <w:pStyle w:val="ListBullet"/>
+      </w:pPr>
+      <w:r>
+        <w:t>The team agrees on the MVP screens and first milestone.</w:t>
+      </w:r>
+    </w:p>
+    <w:p>
+      <w:pPr>
+        <w:pStyle w:val="ListBullet"/>
+      </w:pPr>
+      <w:r>
+        <w:t>The project is ready for coding after explicit permission from the user.</w:t>
+      </w:r>
+    </w:p>
+    <w:p>
+      <w:pPr>
+        <w:pStyle w:val="Heading1"/>
+      </w:pPr>
+      <w:r>
         <w:t>Phase 2: First Demo Version</w:t>
       </w:r>
     </w:p>
@@ -232,7 +462,7 @@
         <w:pStyle w:val="ListBullet"/>
       </w:pPr>
       <w:r>
-        <w:t>Show and edit today?s available time blocks.</w:t>
+        <w:t>Show and edit today's available time blocks.</w:t>
       </w:r>
     </w:p>
     <w:p>
@@ -384,7 +614,7 @@
         <w:pStyle w:val="ListBullet"/>
       </w:pPr>
       <w:r>
-        <w:t>Show simple explanation text, such as ?Scheduled first because it is due soon.?</w:t>
+        <w:t>Show simple explanation text, such as "Scheduled first because it is due soon."</w:t>
       </w:r>
     </w:p>
     <w:p>
@@ -1021,7 +1251,7 @@
     </w:p>
     <w:p>
       <w:r>
-        <w:t>Build through Phase 2.7 first, then pause for review. That creates a complete basic app before adding smarter behavior or advanced features.</w:t>
+        <w:t>Confirm Phase 1 decisions, then build through Phase 2.7 and pause for review. That creates a complete basic app before adding smarter behavior or advanced features.</w:t>
       </w:r>
     </w:p>
     <w:sectPr>
@@ -1464,7 +1694,7 @@
       <w:rFonts w:asciiTheme="majorHAnsi" w:eastAsiaTheme="majorEastAsia" w:hAnsiTheme="majorHAnsi" w:cstheme="majorBidi" w:ascii="Aptos Display" w:hAnsi="Aptos Display"/>
       <w:b/>
       <w:bCs/>
-      <w:color w:val="365F91" w:themeColor="accent1" w:themeShade="BF"/>
+      <w:color w:val="1F4E79"/>
       <w:sz w:val="28"/>
       <w:szCs w:val="28"/>
     </w:rPr>
@@ -1488,7 +1718,7 @@
       <w:rFonts w:asciiTheme="majorHAnsi" w:eastAsiaTheme="majorEastAsia" w:hAnsiTheme="majorHAnsi" w:cstheme="majorBidi" w:ascii="Aptos Display" w:hAnsi="Aptos Display"/>
       <w:b/>
       <w:bCs/>
-      <w:color w:val="4F81BD" w:themeColor="accent1"/>
+      <w:color w:val="1F4E79"/>
       <w:sz w:val="26"/>
       <w:szCs w:val="26"/>
     </w:rPr>
@@ -1512,7 +1742,7 @@
       <w:rFonts w:asciiTheme="majorHAnsi" w:eastAsiaTheme="majorEastAsia" w:hAnsiTheme="majorHAnsi" w:cstheme="majorBidi" w:ascii="Aptos Display" w:hAnsi="Aptos Display"/>
       <w:b/>
       <w:bCs/>
-      <w:color w:val="4F81BD" w:themeColor="accent1"/>
+      <w:color w:val="1F4E79"/>
     </w:rPr>
   </w:style>
   <w:style w:type="paragraph" w:styleId="Heading4">
@@ -1750,7 +1980,7 @@
       <w:contextualSpacing/>
     </w:pPr>
     <w:rPr>
-      <w:rFonts w:asciiTheme="majorHAnsi" w:eastAsiaTheme="majorEastAsia" w:hAnsiTheme="majorHAnsi" w:cstheme="majorBidi" w:ascii="Aptos Display" w:hAnsi="Aptos Display"/>
+      <w:rFonts w:asciiTheme="majorHAnsi" w:eastAsiaTheme="majorEastAsia" w:hAnsiTheme="majorHAnsi" w:cstheme="majorBidi"/>
       <w:color w:val="17365D" w:themeColor="text2" w:themeShade="BF"/>
       <w:spacing w:val="5"/>
       <w:kern w:val="28"/>

</xml_diff>